<commit_message>
Update docs: add .env token management section (4.3b)
</commit_message>
<xml_diff>
--- a/ENTSO-E_Pumpspeicher_Dokumentation.docx
+++ b/ENTSO-E_Pumpspeicher_Dokumentation.docx
@@ -2506,6 +2506,143 @@
           <w:szCs w:val="20"/>
         </w:rPr>
         <w:t xml:space="preserve">Sicherheitshinweis: Token nie in ein öffentliches Git-Repository einchecken. Die Datei .gitignore schliesst die Skripte standardmässig aus oder den Token vor dem Commit entfernen.</w:t>
+      </w:r>
+    </w:p>
+    <w:p>
+      <w:pPr>
+        <w:pStyle w:val="Heading2"/>
+        <w:spacing w:after="120" w:before="300"/>
+      </w:pPr>
+      <w:r>
+        <w:t xml:space="preserve">4.3b Token-Verwaltung via .env-Datei</w:t>
+      </w:r>
+    </w:p>
+    <w:p>
+      <w:pPr>
+        <w:spacing w:after="120"/>
+      </w:pPr>
+      <w:r>
+        <w:rPr>
+          <w:sz w:val="22"/>
+          <w:szCs w:val="22"/>
+        </w:rPr>
+        <w:t xml:space="preserve">Statt den Token direkt ins Skript einzutragen, empfiehlt sich die Verwendung einer .env-Datei im Projektordner. Diese Methode wurde im Rahmen des Git-Workflows eingeführt, um zu verhindern, dass das Credential versehentlich in ein öffentliches Repository eingecheckt wird.</w:t>
+      </w:r>
+    </w:p>
+    <w:p>
+      <w:pPr>
+        <w:spacing w:after="120"/>
+      </w:pPr>
+      <w:r>
+        <w:rPr>
+          <w:sz w:val="22"/>
+          <w:szCs w:val="22"/>
+        </w:rPr>
+        <w:t xml:space="preserve">Inhalt der Datei .env (im selben Ordner wie die Skripte, NIE ins Git-Repo einchecken):</w:t>
+      </w:r>
+    </w:p>
+    <w:p>
+      <w:pPr>
+        <w:shd w:fill="F0F0F0" w:val="clear"/>
+        <w:spacing w:after="80"/>
+        <w:ind w:left="360"/>
+      </w:pPr>
+      <w:r>
+        <w:rPr>
+          <w:rFonts w:ascii="Courier New" w:cs="Courier New" w:hAnsi="Courier New"/>
+          <w:color w:val="333333"/>
+          <w:sz w:val="18"/>
+          <w:szCs w:val="18"/>
+        </w:rPr>
+        <w:t xml:space="preserve">ENTSOE_TOKEN=dein-echter-token</w:t>
+      </w:r>
+    </w:p>
+    <w:p>
+      <w:pPr>
+        <w:spacing w:after="120"/>
+      </w:pPr>
+      <w:r>
+        <w:rPr>
+          <w:sz w:val="22"/>
+          <w:szCs w:val="22"/>
+        </w:rPr>
+        <w:t xml:space="preserve">Die Skripte lesen den Token automatisch via python-dotenv ein (load_dotenv()). Installation:</w:t>
+      </w:r>
+    </w:p>
+    <w:p>
+      <w:pPr>
+        <w:shd w:fill="F0F0F0" w:val="clear"/>
+        <w:spacing w:after="80"/>
+        <w:ind w:left="360"/>
+      </w:pPr>
+      <w:r>
+        <w:rPr>
+          <w:rFonts w:ascii="Courier New" w:cs="Courier New" w:hAnsi="Courier New"/>
+          <w:color w:val="333333"/>
+          <w:sz w:val="18"/>
+          <w:szCs w:val="18"/>
+        </w:rPr>
+        <w:t xml:space="preserve">pip install python-dotenv</w:t>
+      </w:r>
+    </w:p>
+    <w:p>
+      <w:pPr>
+        <w:spacing w:after="120"/>
+      </w:pPr>
+      <w:r>
+        <w:rPr>
+          <w:sz w:val="22"/>
+          <w:szCs w:val="22"/>
+        </w:rPr>
+        <w:t xml:space="preserve">Danach reicht der einfache Aufruf ohne export-Befehl:</w:t>
+      </w:r>
+    </w:p>
+    <w:p>
+      <w:pPr>
+        <w:shd w:fill="F0F0F0" w:val="clear"/>
+        <w:spacing w:after="80"/>
+        <w:ind w:left="360"/>
+      </w:pPr>
+      <w:r>
+        <w:rPr>
+          <w:rFonts w:ascii="Courier New" w:cs="Courier New" w:hAnsi="Courier New"/>
+          <w:color w:val="333333"/>
+          <w:sz w:val="18"/>
+          <w:szCs w:val="18"/>
+        </w:rPr>
+        <w:t xml:space="preserve">source venv/bin/activate</w:t>
+      </w:r>
+    </w:p>
+    <w:p>
+      <w:pPr>
+        <w:shd w:fill="F0F0F0" w:val="clear"/>
+        <w:spacing w:after="80"/>
+        <w:ind w:left="360"/>
+      </w:pPr>
+      <w:r>
+        <w:rPr>
+          <w:rFonts w:ascii="Courier New" w:cs="Courier New" w:hAnsi="Courier New"/>
+          <w:color w:val="333333"/>
+          <w:sz w:val="18"/>
+          <w:szCs w:val="18"/>
+        </w:rPr>
+        <w:t xml:space="preserve">python3 at_pumpspeicher_v4.py --week</w:t>
+      </w:r>
+    </w:p>
+    <w:p>
+      <w:pPr>
+        <w:spacing w:after="100"/>
+        <w:ind w:left="360"/>
+      </w:pPr>
+      <w:r>
+        <w:rPr>
+          <w:i/>
+          <w:iCs/>
+          <w:color w:val="555555"/>
+          <w:sz w:val="20"/>
+          <w:szCs w:val="20"/>
+        </w:rPr>
+        <w:t xml:space="preserve">Sicherheitshinweis: Die .env-Datei ist in der .gitignore eingetragen und wird von Git automatisch ignoriert – der Token kommt nie ins Repository, auch nicht versehentlich.</w:t>
       </w:r>
     </w:p>
     <w:p>

</xml_diff>

<commit_message>
Update docs: add section 4.5 shell wrappers
</commit_message>
<xml_diff>
--- a/ENTSO-E_Pumpspeicher_Dokumentation.docx
+++ b/ENTSO-E_Pumpspeicher_Dokumentation.docx
@@ -2805,6 +2805,179 @@
         </w:pBdr>
         <w:spacing w:after="200"/>
       </w:pPr>
+    </w:p>
+    <w:p>
+      <w:pPr>
+        <w:pStyle w:val="Heading2"/>
+        <w:spacing w:after="120" w:before="300"/>
+      </w:pPr>
+      <w:r>
+        <w:t xml:space="preserve">4.5 Shell-Wrapper – venv automatisch aktivieren</w:t>
+      </w:r>
+    </w:p>
+    <w:p>
+      <w:pPr>
+        <w:spacing w:after="120"/>
+      </w:pPr>
+      <w:r>
+        <w:rPr>
+          <w:sz w:val="22"/>
+          <w:szCs w:val="22"/>
+        </w:rPr>
+        <w:t xml:space="preserve">Damit die virtuelle Umgebung (venv) nicht vor jedem Aufruf manuell aktiviert werden muss, enthält das Repository vier Shell-Wrapper-Skripte. Diese aktivieren die venv automatisch und starten danach das jeweilige Python-Skript:</w:t>
+      </w:r>
+    </w:p>
+    <w:p>
+      <w:pPr>
+        <w:shd w:fill="F0F0F0" w:val="clear"/>
+        <w:spacing w:after="60"/>
+        <w:ind w:left="360"/>
+      </w:pPr>
+      <w:r>
+        <w:rPr>
+          <w:rFonts w:ascii="Courier New" w:cs="Courier New" w:hAnsi="Courier New"/>
+          <w:color w:val="333333"/>
+          <w:sz w:val="18"/>
+          <w:szCs w:val="18"/>
+        </w:rPr>
+        <w:t xml:space="preserve">run_akw.sh               → akw_leistung_ch_v5.py</w:t>
+      </w:r>
+    </w:p>
+    <w:p>
+      <w:pPr>
+        <w:shd w:fill="F0F0F0" w:val="clear"/>
+        <w:spacing w:after="60"/>
+        <w:ind w:left="360"/>
+      </w:pPr>
+      <w:r>
+        <w:rPr>
+          <w:rFonts w:ascii="Courier New" w:cs="Courier New" w:hAnsi="Courier New"/>
+          <w:color w:val="333333"/>
+          <w:sz w:val="18"/>
+          <w:szCs w:val="18"/>
+        </w:rPr>
+        <w:t xml:space="preserve">run_ch_pumpspeicher.sh   → ch_pumpspeicher_v4.py</w:t>
+      </w:r>
+    </w:p>
+    <w:p>
+      <w:pPr>
+        <w:shd w:fill="F0F0F0" w:val="clear"/>
+        <w:spacing w:after="60"/>
+        <w:ind w:left="360"/>
+      </w:pPr>
+      <w:r>
+        <w:rPr>
+          <w:rFonts w:ascii="Courier New" w:cs="Courier New" w:hAnsi="Courier New"/>
+          <w:color w:val="333333"/>
+          <w:sz w:val="18"/>
+          <w:szCs w:val="18"/>
+        </w:rPr>
+        <w:t xml:space="preserve">run_at_pumpspeicher.sh   → at_pumpspeicher_v4.py</w:t>
+      </w:r>
+    </w:p>
+    <w:p>
+      <w:pPr>
+        <w:shd w:fill="F0F0F0" w:val="clear"/>
+        <w:spacing w:after="120"/>
+        <w:ind w:left="360"/>
+      </w:pPr>
+      <w:r>
+        <w:rPr>
+          <w:rFonts w:ascii="Courier New" w:cs="Courier New" w:hAnsi="Courier New"/>
+          <w:color w:val="333333"/>
+          <w:sz w:val="18"/>
+          <w:szCs w:val="18"/>
+        </w:rPr>
+        <w:t xml:space="preserve">run_de_pumpspeicher.sh   → de_pumpspeicher_v4.py</w:t>
+      </w:r>
+    </w:p>
+    <w:p>
+      <w:pPr>
+        <w:spacing w:after="120"/>
+      </w:pPr>
+      <w:r>
+        <w:rPr>
+          <w:sz w:val="22"/>
+          <w:szCs w:val="22"/>
+        </w:rPr>
+        <w:t xml:space="preserve">Einmaliges Ausführbar-Machen nach dem ersten Download:</w:t>
+      </w:r>
+    </w:p>
+    <w:p>
+      <w:pPr>
+        <w:shd w:fill="F0F0F0" w:val="clear"/>
+        <w:spacing w:after="120"/>
+        <w:ind w:left="360"/>
+      </w:pPr>
+      <w:r>
+        <w:rPr>
+          <w:rFonts w:ascii="Courier New" w:cs="Courier New" w:hAnsi="Courier New"/>
+          <w:color w:val="333333"/>
+          <w:sz w:val="18"/>
+          <w:szCs w:val="18"/>
+        </w:rPr>
+        <w:t xml:space="preserve">chmod +x run_akw.sh run_at_pumpspeicher.sh run_ch_pumpspeicher.sh run_de_pumpspeicher.sh</w:t>
+      </w:r>
+    </w:p>
+    <w:p>
+      <w:pPr>
+        <w:spacing w:after="120"/>
+      </w:pPr>
+      <w:r>
+        <w:rPr>
+          <w:sz w:val="22"/>
+          <w:szCs w:val="22"/>
+        </w:rPr>
+        <w:t xml:space="preserve">Danach genügt folgender Aufruf – ohne vorheriges source venv/bin/activate:</w:t>
+      </w:r>
+    </w:p>
+    <w:p>
+      <w:pPr>
+        <w:shd w:fill="F0F0F0" w:val="clear"/>
+        <w:spacing w:after="60"/>
+        <w:ind w:left="360"/>
+      </w:pPr>
+      <w:r>
+        <w:rPr>
+          <w:rFonts w:ascii="Courier New" w:cs="Courier New" w:hAnsi="Courier New"/>
+          <w:color w:val="333333"/>
+          <w:sz w:val="18"/>
+          <w:szCs w:val="18"/>
+        </w:rPr>
+        <w:t xml:space="preserve">./run_akw.sh --week</w:t>
+      </w:r>
+    </w:p>
+    <w:p>
+      <w:pPr>
+        <w:shd w:fill="F0F0F0" w:val="clear"/>
+        <w:spacing w:after="120"/>
+        <w:ind w:left="360"/>
+      </w:pPr>
+      <w:r>
+        <w:rPr>
+          <w:rFonts w:ascii="Courier New" w:cs="Courier New" w:hAnsi="Courier New"/>
+          <w:color w:val="333333"/>
+          <w:sz w:val="18"/>
+          <w:szCs w:val="18"/>
+        </w:rPr>
+        <w:t xml:space="preserve">./run_at_pumpspeicher.sh --week</w:t>
+      </w:r>
+    </w:p>
+    <w:p>
+      <w:pPr>
+        <w:spacing w:after="100"/>
+        <w:ind w:left="360"/>
+      </w:pPr>
+      <w:r>
+        <w:rPr>
+          <w:i/>
+          <w:iCs/>
+          <w:color w:val="555555"/>
+          <w:sz w:val="20"/>
+          <w:szCs w:val="20"/>
+        </w:rPr>
+        <w:t xml:space="preserve">Die Wrapper-Skripte erkennen automatisch ihren eigenen Speicherort und aktivieren die venv relativ dazu – sie funktionieren also unabhaengig davon, aus welchem Verzeichnis heraus sie aufgerufen werden.</w:t>
+      </w:r>
     </w:p>
     <w:p>
       <w:pPr>

</xml_diff>

<commit_message>
Update docs: add chapter 9 Windows 11 setup
</commit_message>
<xml_diff>
--- a/ENTSO-E_Pumpspeicher_Dokumentation.docx
+++ b/ENTSO-E_Pumpspeicher_Dokumentation.docx
@@ -4255,6 +4255,346 @@
       <w:pgNumType/>
       <w:docGrid w:linePitch="360"/>
     </w:sectPr>
+    <w:p>
+      <w:pPr>
+        <w:pStyle w:val="Heading1"/>
+        <w:spacing w:after="160" w:before="400"/>
+      </w:pPr>
+      <w:r>
+        <w:t xml:space="preserve">9. Windows 11 – Setup und Verwendung</w:t>
+      </w:r>
+    </w:p>
+    <w:p>
+      <w:pPr>
+        <w:spacing w:after="120"/>
+      </w:pPr>
+      <w:r>
+        <w:rPr>
+          <w:sz w:val="22"/>
+          <w:szCs w:val="22"/>
+        </w:rPr>
+        <w:t xml:space="preserve">Die Skripte laufen auf Windows 11 mit einigen Besonderheiten im Vergleich zu macOS. Dieser Abschnitt dokumentiert den getesteten Einrichtungsweg.</w:t>
+      </w:r>
+    </w:p>
+    <w:p>
+      <w:pPr>
+        <w:pStyle w:val="Heading2"/>
+        <w:spacing w:after="120" w:before="300"/>
+      </w:pPr>
+      <w:r>
+        <w:t xml:space="preserve">9.1 Repository einrichten (einmalig)</w:t>
+      </w:r>
+    </w:p>
+    <w:p>
+      <w:pPr>
+        <w:shd w:fill="F0F0F0" w:val="clear"/>
+        <w:spacing w:after="60"/>
+        <w:ind w:left="360"/>
+      </w:pPr>
+      <w:r>
+        <w:rPr>
+          <w:rFonts w:ascii="Courier New" w:cs="Courier New" w:hAnsi="Courier New"/>
+          <w:sz w:val="18"/>
+        </w:rPr>
+        <w:t>git init</w:t>
+      </w:r>
+    </w:p>
+    <w:p>
+      <w:pPr>
+        <w:shd w:fill="F0F0F0" w:val="clear"/>
+        <w:spacing w:after="60"/>
+        <w:ind w:left="360"/>
+      </w:pPr>
+      <w:r>
+        <w:rPr>
+          <w:rFonts w:ascii="Courier New" w:cs="Courier New" w:hAnsi="Courier New"/>
+          <w:sz w:val="18"/>
+        </w:rPr>
+        <w:t>git remote add origin https://github.com/tgdbepe4/entsoe-pumpspeicher.git</w:t>
+      </w:r>
+    </w:p>
+    <w:p>
+      <w:pPr>
+        <w:shd w:fill="F0F0F0" w:val="clear"/>
+        <w:spacing w:after="120"/>
+        <w:ind w:left="360"/>
+      </w:pPr>
+      <w:r>
+        <w:rPr>
+          <w:rFonts w:ascii="Courier New" w:cs="Courier New" w:hAnsi="Courier New"/>
+          <w:sz w:val="18"/>
+        </w:rPr>
+        <w:t>git pull origin main</w:t>
+      </w:r>
+    </w:p>
+    <w:p>
+      <w:pPr>
+        <w:pStyle w:val="Heading2"/>
+        <w:spacing w:after="120" w:before="300"/>
+      </w:pPr>
+      <w:r>
+        <w:t xml:space="preserve">9.2 Pakete installieren (einmalig)</w:t>
+      </w:r>
+    </w:p>
+    <w:p>
+      <w:pPr>
+        <w:spacing w:after="80"/>
+      </w:pPr>
+      <w:r>
+        <w:rPr>
+          <w:sz w:val="22"/>
+          <w:szCs w:val="22"/>
+        </w:rPr>
+        <w:t xml:space="preserve">Option A – direkt ins System-Python (einfacher):</w:t>
+      </w:r>
+    </w:p>
+    <w:p>
+      <w:pPr>
+        <w:shd w:fill="F0F0F0" w:val="clear"/>
+        <w:spacing w:after="120"/>
+        <w:ind w:left="360"/>
+      </w:pPr>
+      <w:r>
+        <w:rPr>
+          <w:rFonts w:ascii="Courier New" w:cs="Courier New" w:hAnsi="Courier New"/>
+          <w:sz w:val="18"/>
+        </w:rPr>
+        <w:t>pip install entsoe-py pandas openpyxl python-dotenv</w:t>
+      </w:r>
+    </w:p>
+    <w:p>
+      <w:pPr>
+        <w:spacing w:after="80"/>
+      </w:pPr>
+      <w:r>
+        <w:rPr>
+          <w:sz w:val="22"/>
+          <w:szCs w:val="22"/>
+        </w:rPr>
+        <w:t xml:space="preserve">Option B – in eine venv (saubere Trennung):</w:t>
+      </w:r>
+    </w:p>
+    <w:p>
+      <w:pPr>
+        <w:shd w:fill="F0F0F0" w:val="clear"/>
+        <w:spacing w:after="60"/>
+        <w:ind w:left="360"/>
+      </w:pPr>
+      <w:r>
+        <w:rPr>
+          <w:rFonts w:ascii="Courier New" w:cs="Courier New" w:hAnsi="Courier New"/>
+          <w:sz w:val="18"/>
+        </w:rPr>
+        <w:t>python -m venv venv</w:t>
+      </w:r>
+    </w:p>
+    <w:p>
+      <w:pPr>
+        <w:shd w:fill="F0F0F0" w:val="clear"/>
+        <w:spacing w:after="120"/>
+        <w:ind w:left="360"/>
+      </w:pPr>
+      <w:r>
+        <w:rPr>
+          <w:rFonts w:ascii="Courier New" w:cs="Courier New" w:hAnsi="Courier New"/>
+          <w:sz w:val="18"/>
+        </w:rPr>
+        <w:t>venv\Scripts\python.exe -m pip install entsoe-py pandas openpyxl python-dotenv</w:t>
+      </w:r>
+    </w:p>
+    <w:p>
+      <w:pPr>
+        <w:pStyle w:val="Heading2"/>
+        <w:spacing w:after="120" w:before="300"/>
+      </w:pPr>
+      <w:r>
+        <w:t xml:space="preserve">9.3 .env-Datei erstellen (einmalig)</w:t>
+      </w:r>
+    </w:p>
+    <w:p>
+      <w:pPr>
+        <w:spacing w:after="80"/>
+      </w:pPr>
+      <w:r>
+        <w:rPr>
+          <w:sz w:val="22"/>
+          <w:szCs w:val="22"/>
+        </w:rPr>
+        <w:t xml:space="preserve">WICHTIG: echo in PowerShell schreibt UTF-16 statt UTF-8. dotenv erwartet UTF-8. Daher diesen Befehl verwenden:</w:t>
+      </w:r>
+    </w:p>
+    <w:p>
+      <w:pPr>
+        <w:shd w:fill="F0F0F0" w:val="clear"/>
+        <w:spacing w:after="120"/>
+        <w:ind w:left="360"/>
+      </w:pPr>
+      <w:r>
+        <w:rPr>
+          <w:rFonts w:ascii="Courier New" w:cs="Courier New" w:hAnsi="Courier New"/>
+          <w:sz w:val="18"/>
+        </w:rPr>
+        <w:t>[System.IO.File]::WriteAllText("$PWD\.env", "ENTSOE_TOKEN=dein-token`n", [System.Text.Encoding]::UTF8)</w:t>
+      </w:r>
+    </w:p>
+    <w:p>
+      <w:pPr>
+        <w:spacing w:after="80"/>
+      </w:pPr>
+      <w:r>
+        <w:rPr>
+          <w:sz w:val="22"/>
+          <w:szCs w:val="22"/>
+        </w:rPr>
+        <w:t xml:space="preserve">Alternativ: .env in VS Code oder Notepad als UTF-8 speichern.</w:t>
+      </w:r>
+    </w:p>
+    <w:p>
+      <w:pPr>
+        <w:pStyle w:val="Heading2"/>
+        <w:spacing w:after="120" w:before="300"/>
+      </w:pPr>
+      <w:r>
+        <w:t xml:space="preserve">9.4 Skripte starten</w:t>
+      </w:r>
+    </w:p>
+    <w:p>
+      <w:pPr>
+        <w:spacing w:after="80"/>
+      </w:pPr>
+      <w:r>
+        <w:rPr>
+          <w:sz w:val="22"/>
+          <w:szCs w:val="22"/>
+        </w:rPr>
+        <w:t xml:space="preserve">Direkt mit Python:</w:t>
+      </w:r>
+    </w:p>
+    <w:p>
+      <w:pPr>
+        <w:shd w:fill="F0F0F0" w:val="clear"/>
+        <w:spacing w:after="60"/>
+        <w:ind w:left="360"/>
+      </w:pPr>
+      <w:r>
+        <w:rPr>
+          <w:rFonts w:ascii="Courier New" w:cs="Courier New" w:hAnsi="Courier New"/>
+          <w:sz w:val="18"/>
+        </w:rPr>
+        <w:t>python at_pumpspeicher_v4.py --week</w:t>
+      </w:r>
+    </w:p>
+    <w:p>
+      <w:pPr>
+        <w:shd w:fill="F0F0F0" w:val="clear"/>
+        <w:spacing w:after="120"/>
+        <w:ind w:left="360"/>
+      </w:pPr>
+      <w:r>
+        <w:rPr>
+          <w:rFonts w:ascii="Courier New" w:cs="Courier New" w:hAnsi="Courier New"/>
+          <w:sz w:val="18"/>
+        </w:rPr>
+        <w:t>python akw_leistung_ch_v5.py --week</w:t>
+      </w:r>
+    </w:p>
+    <w:p>
+      <w:pPr>
+        <w:spacing w:after="80"/>
+      </w:pPr>
+      <w:r>
+        <w:rPr>
+          <w:sz w:val="22"/>
+          <w:szCs w:val="22"/>
+        </w:rPr>
+        <w:t xml:space="preserve">Oder mit den Windows Batch-Wrappern (aktivieren venv automatisch, fallback auf System-Python):</w:t>
+      </w:r>
+    </w:p>
+    <w:p>
+      <w:pPr>
+        <w:shd w:fill="F0F0F0" w:val="clear"/>
+        <w:spacing w:after="60"/>
+        <w:ind w:left="360"/>
+      </w:pPr>
+      <w:r>
+        <w:rPr>
+          <w:rFonts w:ascii="Courier New" w:cs="Courier New" w:hAnsi="Courier New"/>
+          <w:sz w:val="18"/>
+        </w:rPr>
+        <w:t>.\run_at_pumpspeicher.bat --week</w:t>
+      </w:r>
+    </w:p>
+    <w:p>
+      <w:pPr>
+        <w:shd w:fill="F0F0F0" w:val="clear"/>
+        <w:spacing w:after="120"/>
+        <w:ind w:left="360"/>
+      </w:pPr>
+      <w:r>
+        <w:rPr>
+          <w:rFonts w:ascii="Courier New" w:cs="Courier New" w:hAnsi="Courier New"/>
+          <w:sz w:val="18"/>
+        </w:rPr>
+        <w:t>.\run_akw.bat --week</w:t>
+      </w:r>
+    </w:p>
+    <w:p>
+      <w:pPr>
+        <w:pStyle w:val="Heading2"/>
+        <w:spacing w:after="120" w:before="300"/>
+      </w:pPr>
+      <w:r>
+        <w:t xml:space="preserve">9.5 Bekannte Windows-Besonderheiten</w:t>
+      </w:r>
+    </w:p>
+    <w:p>
+      <w:pPr>
+        <w:spacing w:after="80"/>
+      </w:pPr>
+      <w:r>
+        <w:rPr>
+          <w:sz w:val="22"/>
+          <w:szCs w:val="22"/>
+        </w:rPr>
+        <w:t xml:space="preserve">• PowerShell blockiert .ps1-Skripte (Execution Policy). Die .bat-Wrapper umgehen das Problem.</w:t>
+      </w:r>
+    </w:p>
+    <w:p>
+      <w:pPr>
+        <w:spacing w:after="80"/>
+      </w:pPr>
+      <w:r>
+        <w:rPr>
+          <w:sz w:val="22"/>
+          <w:szCs w:val="22"/>
+        </w:rPr>
+        <w:t xml:space="preserve">• echo schreibt UTF-16, dotenv erwartet UTF-8 – .env mit WriteAllText oder VS Code erstellen.</w:t>
+      </w:r>
+    </w:p>
+    <w:p>
+      <w:pPr>
+        <w:spacing w:after="80"/>
+      </w:pPr>
+      <w:r>
+        <w:rPr>
+          <w:sz w:val="22"/>
+          <w:szCs w:val="22"/>
+        </w:rPr>
+        <w:t xml:space="preserve">• .sh-Wrapper (macOS) und .bat-Wrapper (Windows) koexistieren problemlos im selben Repository.</w:t>
+      </w:r>
+    </w:p>
+    <w:p>
+      <w:pPr>
+        <w:spacing w:after="80"/>
+      </w:pPr>
+      <w:r>
+        <w:rPr>
+          <w:sz w:val="22"/>
+          <w:szCs w:val="22"/>
+        </w:rPr>
+        <w:t xml:space="preserve">• git pull funktioniert nur in einem initialisierten Repository (git init + git remote add origin).</w:t>
+      </w:r>
+    </w:p>
   </w:body>
 </w:document>
 </file>

</xml_diff>